<commit_message>
Unificar severidad de Supabase (INFO) y corregir referencias cruzadas en todos los documentos
</commit_message>
<xml_diff>
--- a/Informe_FINAL.docx
+++ b/Informe_FINAL.docx
@@ -1083,10 +1083,10 @@
           <w:b/>
           <w:bCs/>
         </w:rPr>
-        <w:t>2 vulnerabilidades críticas, 2 altas y 2 medias</w:t>
-      </w:r>
-      <w:r>
-        <w:t>, además de 1 hallazgo informativo y 2 controles verificados como correctos. Destacan la ausencia total de cabeceras de seguridad HTTP y la posibilidad de suplantación de correo del dominio (email spoofing), así como la exposición de datos de usuario e identificadores internos sin autenticación. La aplicación presenta deficiencias de configuración que deben corregirse antes de un despliegue en producción real.</w:t>
+        <w:t>2 vulnerabilidades críticas, 2 altas y 1 media</w:t>
+      </w:r>
+      <w:r>
+        <w:t>, además de 2 hallazgos informativos y 2 controles verificados como correctos. Destacan la ausencia total de cabeceras de seguridad HTTP y la posibilidad de suplantación de correo del dominio (email spoofing), así como la exposición de datos de usuario e identificadores internos sin autenticación. La aplicación presenta deficiencias de configuración que deben corregirse antes de un despliegue en producción real.</w:t>
       </w:r>
     </w:p>
     <w:p>
@@ -2797,7 +2797,7 @@
         <w:tc>
           <w:tcPr>
             <w:tcW w:w="650" w:type="pct"/>
-            <w:shd w:val="clear" w:color="auto" w:fill="C77800"/>
+            <w:shd w:val="clear" w:color="auto" w:fill="17A2B8"/>
             <w:tcMar>
               <w:top w:w="60" w:type="dxa"/>
               <w:left w:w="90" w:type="dxa"/>
@@ -6492,7 +6492,7 @@
         <w:tc>
           <w:tcPr>
             <w:tcW w:w="800" w:type="pct"/>
-            <w:shd w:val="clear" w:color="auto" w:fill="C77800"/>
+            <w:shd w:val="clear" w:color="auto" w:fill="17A2B8"/>
             <w:tcMar>
               <w:top w:w="70" w:type="dxa"/>
               <w:left w:w="60" w:type="dxa"/>
@@ -8306,7 +8306,7 @@
         <w:jc w:val="both"/>
       </w:pPr>
       <w:r>
-        <w:t xml:space="preserve">Aunque el ejercicio fue no destructivo, conviene analizar la cadena de consecuencias que habilitarían los hallazgos en un escenario real. La ausencia de cabeceras de seguridad (H-01) amplía el impacto de cualquier XSS futuro y habilita clickjacking y ataques de downgrade. La exposición de identificadores internos de usuario (H-06), unida a la accesibilidad de recursos por ID (H-05), constituye la base para ataques </w:t>
+        <w:t xml:space="preserve">Aunque el ejercicio fue no destructivo, conviene analizar la cadena de consecuencias que habilitarían los hallazgos en un escenario real. La ausencia de cabeceras de seguridad (H-01) amplía el impacto de cualquier XSS futuro y habilita clickjacking y ataques de downgrade. La exposición de identificadores internos de usuario (H-04), unida a la accesibilidad de recursos por ID (H-07), constituye la base para ataques </w:t>
       </w:r>
       <w:r>
         <w:rPr>
@@ -8325,7 +8325,7 @@
         <w:jc w:val="both"/>
       </w:pPr>
       <w:r>
-        <w:t xml:space="preserve">Por su parte, la posibilidad de suplantación de correo (H-03) permitiría campañas de </w:t>
+        <w:t xml:space="preserve">Por su parte, la posibilidad de suplantación de correo (H-02) permitiría campañas de </w:t>
       </w:r>
       <w:r>
         <w:rPr>
@@ -8335,7 +8335,7 @@
         <w:t>phishing</w:t>
       </w:r>
       <w:r>
-        <w:t xml:space="preserve"> creíbles contra los usuarios enumerados, mientras que la exposición de la infraestructura Supabase (H-07) y de las credenciales de Sentry (H-02) proporcionaría a un atacante información valiosa para orientar fases posteriores. La defensa debe operar por capas —prevención, contención y detección— combinando control de acceso estricto en el servidor, mínimo privilegio en el backend y monitorización de accesos anómalos.</w:t>
+        <w:t xml:space="preserve"> creíbles contra los usuarios enumerados, mientras que la exposición de la infraestructura Supabase (H-06) y de las credenciales de Sentry (H-03) proporcionaría a un atacante información valiosa para orientar fases posteriores. La defensa debe operar por capas —prevención, contención y detección— combinando control de acceso estricto en el servidor, mínimo privilegio en el backend y monitorización de accesos anómalos.</w:t>
       </w:r>
     </w:p>
     <w:p>

</xml_diff>